<commit_message>
Nishaan's guest AccessID has a form, not a vague ask
The author supplied WSU's Single guest ID account request. It replaces 'a sponsored AccessID;
Andreea's office can request it' in the annotator email and both mentions in the proposal.
A link someone can click is the difference between a personnel entry that gets made and one
that waits on an email.

Co-Authored-By: Claude Fable 5.1 <noreply@anthropic.com>
</commit_message>
<xml_diff>
--- a/proposals/XR_Fracture_Detector_Proposal.docx
+++ b/proposals/XR_Fracture_Detector_Proposal.docx
@@ -1290,7 +1290,7 @@
               <w:t xml:space="preserve"> </w:t>
             </w:r>
             <w:r>
-              <w:t xml:space="preserve">Every personnel entry in this protocol carries a WSU AccessID, and Obligations and COI are signed in eProtocol. He will need a sponsored/guest WSU AccessID before he can be listed; CITI must then be completed under that WSU affiliation so the protocol can pull his record.</w:t>
+              <w:t xml:space="preserve">Every personnel entry in this protocol carries a WSU AccessID, and Obligations and COI are signed in eProtocol. He will need a guest WSU AccessID before he can be listed (Single guest ID account request: https://services.wayne.edu/TDClient/277/Portal/Requests/ServiceOffering/208/Single-guest-ID-account-request/Request); CITI must then be completed under that WSU affiliation so the protocol can pull his record.</w:t>
             </w:r>
           </w:p>
         </w:tc>
@@ -1639,7 +1639,7 @@
         </w:numPr>
       </w:pPr>
       <w:r>
-        <w:t xml:space="preserve">A sponsored WSU AccessID for Nishaan Makim.</w:t>
+        <w:t xml:space="preserve">A guest WSU AccessID for Nishaan Makim (form linked in the personnel table).</w:t>
       </w:r>
     </w:p>
     <w:bookmarkEnd w:id="18"/>

</xml_diff>